<commit_message>
update: Report and document
</commit_message>
<xml_diff>
--- a/Report/hthinh/measure + column.docx
+++ b/Report/hthinh/measure + column.docx
@@ -33,15 +33,15 @@
           <w:b/>
           <w:bCs/>
         </w:rPr>
-        <w:t>1. T</w:t>
-      </w:r>
-      <w:proofErr w:type="spellStart"/>
-      <w:r>
-        <w:rPr>
-          <w:b/>
-          <w:bCs/>
-        </w:rPr>
-        <w:t>ổng</w:t>
+        <w:t xml:space="preserve">1. </w:t>
+      </w:r>
+      <w:proofErr w:type="spellStart"/>
+      <w:r>
+        <w:rPr>
+          <w:b/>
+          <w:bCs/>
+        </w:rPr>
+        <w:t>Tổng</w:t>
       </w:r>
       <w:proofErr w:type="spellEnd"/>
       <w:r>
@@ -1803,6 +1803,7 @@
       <w:pPr>
         <w:rPr>
           <w:highlight w:val="yellow"/>
+          <w:lang w:val="vi-VN"/>
         </w:rPr>
       </w:pPr>
       <w:r>
@@ -1811,6 +1812,357 @@
         </w:rPr>
         <w:t>)</w:t>
       </w:r>
+    </w:p>
+    <w:p>
+      <w:pPr>
+        <w:rPr>
+          <w:b/>
+          <w:bCs/>
+          <w:u w:val="single"/>
+          <w:lang w:val="vi-VN"/>
+        </w:rPr>
+      </w:pPr>
+      <w:r>
+        <w:rPr>
+          <w:b/>
+          <w:bCs/>
+          <w:u w:val="single"/>
+          <w:lang w:val="vi-VN"/>
+        </w:rPr>
+        <w:t>7. Gom nhóm Béo phì</w:t>
+      </w:r>
+    </w:p>
+    <w:p>
+      <w:pPr>
+        <w:rPr>
+          <w:highlight w:val="yellow"/>
+        </w:rPr>
+      </w:pPr>
+      <w:proofErr w:type="spellStart"/>
+      <w:r>
+        <w:rPr>
+          <w:highlight w:val="yellow"/>
+        </w:rPr>
+        <w:t>BMI_Category</w:t>
+      </w:r>
+      <w:proofErr w:type="spellEnd"/>
+      <w:r>
+        <w:rPr>
+          <w:highlight w:val="yellow"/>
+        </w:rPr>
+        <w:t xml:space="preserve"> = </w:t>
+      </w:r>
+      <w:proofErr w:type="gramStart"/>
+      <w:r>
+        <w:rPr>
+          <w:highlight w:val="yellow"/>
+        </w:rPr>
+        <w:t>SWITCH(</w:t>
+      </w:r>
+      <w:proofErr w:type="gramEnd"/>
+    </w:p>
+    <w:p>
+      <w:pPr>
+        <w:rPr>
+          <w:highlight w:val="yellow"/>
+        </w:rPr>
+      </w:pPr>
+      <w:r>
+        <w:rPr>
+          <w:highlight w:val="yellow"/>
+        </w:rPr>
+        <w:t xml:space="preserve">    </w:t>
+      </w:r>
+      <w:proofErr w:type="gramStart"/>
+      <w:r>
+        <w:rPr>
+          <w:highlight w:val="yellow"/>
+        </w:rPr>
+        <w:t>TRUE(</w:t>
+      </w:r>
+      <w:proofErr w:type="gramEnd"/>
+      <w:r>
+        <w:rPr>
+          <w:highlight w:val="yellow"/>
+        </w:rPr>
+        <w:t>),</w:t>
+      </w:r>
+    </w:p>
+    <w:p>
+      <w:pPr>
+        <w:rPr>
+          <w:highlight w:val="yellow"/>
+        </w:rPr>
+      </w:pPr>
+      <w:r>
+        <w:rPr>
+          <w:highlight w:val="yellow"/>
+        </w:rPr>
+        <w:t>    '</w:t>
+      </w:r>
+      <w:proofErr w:type="spellStart"/>
+      <w:r>
+        <w:rPr>
+          <w:highlight w:val="yellow"/>
+        </w:rPr>
+        <w:t>HealthRecord</w:t>
+      </w:r>
+      <w:proofErr w:type="spellEnd"/>
+      <w:r>
+        <w:rPr>
+          <w:highlight w:val="yellow"/>
+        </w:rPr>
+        <w:t>'[BMI] &lt; 18.5, "Underweight</w:t>
+      </w:r>
+      <w:proofErr w:type="gramStart"/>
+      <w:r>
+        <w:rPr>
+          <w:highlight w:val="yellow"/>
+        </w:rPr>
+        <w:t xml:space="preserve">",   </w:t>
+      </w:r>
+      <w:proofErr w:type="gramEnd"/>
+      <w:r>
+        <w:rPr>
+          <w:highlight w:val="yellow"/>
+        </w:rPr>
+        <w:t xml:space="preserve">   -- </w:t>
+      </w:r>
+      <w:proofErr w:type="spellStart"/>
+      <w:r>
+        <w:rPr>
+          <w:highlight w:val="yellow"/>
+        </w:rPr>
+        <w:t>Dùng</w:t>
+      </w:r>
+      <w:proofErr w:type="spellEnd"/>
+      <w:r>
+        <w:rPr>
+          <w:highlight w:val="yellow"/>
+        </w:rPr>
+        <w:t xml:space="preserve"> </w:t>
+      </w:r>
+      <w:proofErr w:type="spellStart"/>
+      <w:r>
+        <w:rPr>
+          <w:highlight w:val="yellow"/>
+        </w:rPr>
+        <w:t>dấu</w:t>
+      </w:r>
+      <w:proofErr w:type="spellEnd"/>
+      <w:r>
+        <w:rPr>
+          <w:highlight w:val="yellow"/>
+        </w:rPr>
+        <w:t xml:space="preserve"> </w:t>
+      </w:r>
+      <w:proofErr w:type="spellStart"/>
+      <w:r>
+        <w:rPr>
+          <w:highlight w:val="yellow"/>
+        </w:rPr>
+        <w:t>chấm</w:t>
+      </w:r>
+      <w:proofErr w:type="spellEnd"/>
+      <w:r>
+        <w:rPr>
+          <w:highlight w:val="yellow"/>
+        </w:rPr>
+        <w:t xml:space="preserve"> (.) </w:t>
+      </w:r>
+      <w:proofErr w:type="spellStart"/>
+      <w:r>
+        <w:rPr>
+          <w:highlight w:val="yellow"/>
+        </w:rPr>
+        <w:t>thay</w:t>
+      </w:r>
+      <w:proofErr w:type="spellEnd"/>
+      <w:r>
+        <w:rPr>
+          <w:highlight w:val="yellow"/>
+        </w:rPr>
+        <w:t xml:space="preserve"> </w:t>
+      </w:r>
+      <w:proofErr w:type="spellStart"/>
+      <w:r>
+        <w:rPr>
+          <w:highlight w:val="yellow"/>
+        </w:rPr>
+        <w:t>vì</w:t>
+      </w:r>
+      <w:proofErr w:type="spellEnd"/>
+      <w:r>
+        <w:rPr>
+          <w:highlight w:val="yellow"/>
+        </w:rPr>
+        <w:t xml:space="preserve"> </w:t>
+      </w:r>
+      <w:proofErr w:type="spellStart"/>
+      <w:r>
+        <w:rPr>
+          <w:highlight w:val="yellow"/>
+        </w:rPr>
+        <w:t>phẩy</w:t>
+      </w:r>
+      <w:proofErr w:type="spellEnd"/>
+    </w:p>
+    <w:p>
+      <w:pPr>
+        <w:rPr>
+          <w:highlight w:val="yellow"/>
+        </w:rPr>
+      </w:pPr>
+      <w:r>
+        <w:rPr>
+          <w:highlight w:val="yellow"/>
+        </w:rPr>
+        <w:t>    '</w:t>
+      </w:r>
+      <w:proofErr w:type="spellStart"/>
+      <w:r>
+        <w:rPr>
+          <w:highlight w:val="yellow"/>
+        </w:rPr>
+        <w:t>HealthRecord</w:t>
+      </w:r>
+      <w:proofErr w:type="spellEnd"/>
+      <w:r>
+        <w:rPr>
+          <w:highlight w:val="yellow"/>
+        </w:rPr>
+        <w:t xml:space="preserve">'[BMI] &lt; </w:t>
+      </w:r>
+      <w:proofErr w:type="gramStart"/>
+      <w:r>
+        <w:rPr>
+          <w:highlight w:val="yellow"/>
+        </w:rPr>
+        <w:t xml:space="preserve">25,   </w:t>
+      </w:r>
+      <w:proofErr w:type="gramEnd"/>
+      <w:r>
+        <w:rPr>
+          <w:highlight w:val="yellow"/>
+        </w:rPr>
+        <w:t>"Normal Weight",</w:t>
+      </w:r>
+    </w:p>
+    <w:p>
+      <w:pPr>
+        <w:rPr>
+          <w:highlight w:val="yellow"/>
+        </w:rPr>
+      </w:pPr>
+      <w:r>
+        <w:rPr>
+          <w:highlight w:val="yellow"/>
+        </w:rPr>
+        <w:t>    '</w:t>
+      </w:r>
+      <w:proofErr w:type="spellStart"/>
+      <w:r>
+        <w:rPr>
+          <w:highlight w:val="yellow"/>
+        </w:rPr>
+        <w:t>HealthRecord</w:t>
+      </w:r>
+      <w:proofErr w:type="spellEnd"/>
+      <w:r>
+        <w:rPr>
+          <w:highlight w:val="yellow"/>
+        </w:rPr>
+        <w:t xml:space="preserve">'[BMI] &lt; </w:t>
+      </w:r>
+      <w:proofErr w:type="gramStart"/>
+      <w:r>
+        <w:rPr>
+          <w:highlight w:val="yellow"/>
+        </w:rPr>
+        <w:t xml:space="preserve">30,   </w:t>
+      </w:r>
+      <w:proofErr w:type="gramEnd"/>
+      <w:r>
+        <w:rPr>
+          <w:highlight w:val="yellow"/>
+        </w:rPr>
+        <w:t>"Overweight",</w:t>
+      </w:r>
+    </w:p>
+    <w:p>
+      <w:pPr>
+        <w:rPr>
+          <w:highlight w:val="yellow"/>
+        </w:rPr>
+      </w:pPr>
+      <w:r>
+        <w:rPr>
+          <w:highlight w:val="yellow"/>
+        </w:rPr>
+        <w:t>    '</w:t>
+      </w:r>
+      <w:proofErr w:type="spellStart"/>
+      <w:r>
+        <w:rPr>
+          <w:highlight w:val="yellow"/>
+        </w:rPr>
+        <w:t>HealthRecord</w:t>
+      </w:r>
+      <w:proofErr w:type="spellEnd"/>
+      <w:r>
+        <w:rPr>
+          <w:highlight w:val="yellow"/>
+        </w:rPr>
+        <w:t xml:space="preserve">'[BMI] &gt;= </w:t>
+      </w:r>
+      <w:proofErr w:type="gramStart"/>
+      <w:r>
+        <w:rPr>
+          <w:highlight w:val="yellow"/>
+        </w:rPr>
+        <w:t>30,  "</w:t>
+      </w:r>
+      <w:proofErr w:type="gramEnd"/>
+      <w:r>
+        <w:rPr>
+          <w:highlight w:val="yellow"/>
+        </w:rPr>
+        <w:t>Obese",</w:t>
+      </w:r>
+    </w:p>
+    <w:p>
+      <w:pPr>
+        <w:rPr>
+          <w:highlight w:val="yellow"/>
+        </w:rPr>
+      </w:pPr>
+      <w:r>
+        <w:rPr>
+          <w:highlight w:val="yellow"/>
+        </w:rPr>
+        <w:t>    "Unknown"</w:t>
+      </w:r>
+    </w:p>
+    <w:p>
+      <w:pPr>
+        <w:rPr>
+          <w:highlight w:val="yellow"/>
+        </w:rPr>
+      </w:pPr>
+      <w:r>
+        <w:rPr>
+          <w:highlight w:val="yellow"/>
+        </w:rPr>
+        <w:t>)</w:t>
+      </w:r>
+    </w:p>
+    <w:p>
+      <w:pPr>
+        <w:rPr>
+          <w:highlight w:val="yellow"/>
+          <w:lang w:val="vi-VN"/>
+        </w:rPr>
+      </w:pPr>
     </w:p>
     <w:p>
       <w:pPr>
@@ -4054,10 +4406,10 @@
             <v:path o:extrusionok="f" gradientshapeok="t" o:connecttype="rect"/>
             <o:lock v:ext="edit" aspectratio="t"/>
           </v:shapetype>
-          <v:shape id="_x0000_i1025" type="#_x0000_t75" style="width:528.5pt;height:29pt" o:ole="">
+          <v:shape id="_x0000_i1025" type="#_x0000_t75" style="width:528.15pt;height:29.15pt" o:ole="">
             <v:imagedata r:id="rId4" o:title=""/>
           </v:shape>
-          <o:OLEObject Type="Embed" ProgID="Word.OpenDocumentText.12" ShapeID="_x0000_i1025" DrawAspect="Content" ObjectID="_1826059339" r:id="rId5"/>
+          <o:OLEObject Type="Embed" ProgID="Word.OpenDocumentText.12" ShapeID="_x0000_i1025" DrawAspect="Content" ObjectID="_1826139771" r:id="rId5"/>
         </w:object>
       </w:r>
     </w:p>

</xml_diff>